<commit_message>
fix: number of test cases
</commit_message>
<xml_diff>
--- a/srs/COMP3211_PIM_SRS.docx
+++ b/srs/COMP3211_PIM_SRS.docx
@@ -3556,7 +3556,21 @@
                 <w:sz w:val="20"/>
                 <w:szCs w:val="20"/>
               </w:rPr>
-              <w:t>Fixed GAP-01 to GAP-05 in the code with a regression test for each (32 tests pass, 100% model line coverage). Updated the affected evidence labels; Section 6.13 now records the fixes.</w:t>
+              <w:t>Fixed GAP-01 to GAP-05 in the code with a regression test for each (3</w:t>
+            </w:r>
+            <w:r>
+              <w:rPr>
+                <w:sz w:val="20"/>
+                <w:szCs w:val="20"/>
+              </w:rPr>
+              <w:t>1</w:t>
+            </w:r>
+            <w:r>
+              <w:rPr>
+                <w:sz w:val="20"/>
+                <w:szCs w:val="20"/>
+              </w:rPr>
+              <w:t xml:space="preserve"> tests pass, 100% model line coverage). Updated the affected evidence labels; Section 6.13 now records the fixes.</w:t>
             </w:r>
           </w:p>
         </w:tc>
@@ -4333,7 +4347,21 @@
                 <w:sz w:val="20"/>
                 <w:szCs w:val="20"/>
               </w:rPr>
-              <w:t xml:space="preserve"> and none terminates the session. The unit suite (32 tests) passed in the same environment.</w:t>
+              <w:t xml:space="preserve"> and none terminates the session. The unit suite (3</w:t>
+            </w:r>
+            <w:r>
+              <w:rPr>
+                <w:sz w:val="20"/>
+                <w:szCs w:val="20"/>
+              </w:rPr>
+              <w:t>1</w:t>
+            </w:r>
+            <w:r>
+              <w:rPr>
+                <w:sz w:val="20"/>
+                <w:szCs w:val="20"/>
+              </w:rPr>
+              <w:t xml:space="preserve"> tests) passed in the same environment.</w:t>
             </w:r>
           </w:p>
         </w:tc>
@@ -7263,7 +7291,21 @@
                 <w:sz w:val="20"/>
                 <w:szCs w:val="20"/>
               </w:rPr>
-              <w:t>S1 — Status: Tested (32 tests pass [S6])</w:t>
+              <w:t>S1 — Status: Tested (</w:t>
+            </w:r>
+            <w:r>
+              <w:rPr>
+                <w:sz w:val="20"/>
+                <w:szCs w:val="20"/>
+              </w:rPr>
+              <w:t>31</w:t>
+            </w:r>
+            <w:r>
+              <w:rPr>
+                <w:sz w:val="20"/>
+                <w:szCs w:val="20"/>
+              </w:rPr>
+              <w:t xml:space="preserve"> tests pass [S6])</w:t>
             </w:r>
           </w:p>
         </w:tc>
@@ -7851,7 +7893,21 @@
                 <w:sz w:val="20"/>
                 <w:szCs w:val="20"/>
               </w:rPr>
-              <w:t>tests/test_model.py (31 tests), tests/test_controller.py (1 test)</w:t>
+              <w:t>tests/test_model.py (3</w:t>
+            </w:r>
+            <w:r>
+              <w:rPr>
+                <w:sz w:val="20"/>
+                <w:szCs w:val="20"/>
+              </w:rPr>
+              <w:t>0</w:t>
+            </w:r>
+            <w:r>
+              <w:rPr>
+                <w:sz w:val="20"/>
+                <w:szCs w:val="20"/>
+              </w:rPr>
+              <w:t xml:space="preserve"> tests), tests/test_controller.py (1 test)</w:t>
             </w:r>
           </w:p>
         </w:tc>
@@ -16381,7 +16437,21 @@
                 <w:sz w:val="20"/>
                 <w:szCs w:val="20"/>
               </w:rPr>
-              <w:t>Tested (32 tests)</w:t>
+              <w:t>Tested (3</w:t>
+            </w:r>
+            <w:r>
+              <w:rPr>
+                <w:sz w:val="20"/>
+                <w:szCs w:val="20"/>
+              </w:rPr>
+              <w:t>1</w:t>
+            </w:r>
+            <w:r>
+              <w:rPr>
+                <w:sz w:val="20"/>
+                <w:szCs w:val="20"/>
+              </w:rPr>
+              <w:t xml:space="preserve"> tests)</w:t>
             </w:r>
           </w:p>
         </w:tc>
@@ -19201,11 +19271,6 @@
         <w:docPartUnique/>
       </w:docPartObj>
     </w:sdtPr>
-    <w:sdtEndPr>
-      <w:rPr>
-        <w:rStyle w:val="affa"/>
-      </w:rPr>
-    </w:sdtEndPr>
     <w:sdtContent>
       <w:p>
         <w:pPr>

</xml_diff>